<commit_message>
add full tabset fragment example
</commit_message>
<xml_diff>
--- a/_book/examples/asciicast/asciicast-default.docx
+++ b/_book/examples/asciicast/asciicast-default.docx
@@ -103,7 +103,7 @@
         <w:pStyle w:val="Heading2"/>
       </w:pPr>
       <w:r>
-        <w:t xml:space="preserve">NEw slide</w:t>
+        <w:t xml:space="preserve">New slide</w:t>
       </w:r>
     </w:p>
     <w:p>
@@ -294,7 +294,11 @@
       </w:r>
     </w:p>
     <w:bookmarkEnd w:id="27"/>
-    <w:sectPr/>
+    <w:sectPr>
+      <w:footnotePr>
+        <w:numRestart w:val="eachSect"/>
+      </w:footnotePr>
+    </w:sectPr>
   </w:body>
 </w:document>
 </file>
@@ -466,8 +470,6 @@
     </w:pPr>
     <w:rPr>
       <w:rFonts w:asciiTheme="majorHAnsi" w:cstheme="majorBidi" w:eastAsiaTheme="majorEastAsia" w:hAnsiTheme="majorHAnsi"/>
-      <w:spacing w:val="-10"/>
-      <w:kern w:val="28"/>
       <w:sz w:val="56"/>
       <w:szCs w:val="56"/>
     </w:rPr>
@@ -480,8 +482,6 @@
     <w:rsid w:val="00A10FD9"/>
     <w:rPr>
       <w:rFonts w:asciiTheme="majorHAnsi" w:cstheme="majorBidi" w:eastAsiaTheme="majorEastAsia" w:hAnsiTheme="majorHAnsi"/>
-      <w:spacing w:val="-10"/>
-      <w:kern w:val="28"/>
       <w:sz w:val="56"/>
       <w:szCs w:val="56"/>
     </w:rPr>
@@ -522,23 +522,31 @@
   </w:style>
   <w:style w:customStyle="1" w:styleId="Author" w:type="paragraph">
     <w:name w:val="Author"/>
+    <w:basedOn w:val="Title"/>
     <w:next w:val="BodyText"/>
     <w:qFormat/>
     <w:pPr>
       <w:keepNext/>
       <w:keepLines/>
-      <w:jc w:val="center"/>
-    </w:pPr>
+    </w:pPr>
+    <w:rPr>
+      <w:sz w:val="24"/>
+      <w:szCs w:val="24"/>
+    </w:rPr>
   </w:style>
   <w:style w:styleId="Date" w:type="paragraph">
     <w:name w:val="Date"/>
+    <w:basedOn w:val="Title"/>
     <w:next w:val="BodyText"/>
     <w:qFormat/>
     <w:pPr>
       <w:keepNext/>
       <w:keepLines/>
-      <w:jc w:val="center"/>
-    </w:pPr>
+    </w:pPr>
+    <w:rPr>
+      <w:sz w:val="24"/>
+      <w:szCs w:val="24"/>
+    </w:rPr>
   </w:style>
   <w:style w:customStyle="1" w:styleId="AbstractTitle" w:type="paragraph">
     <w:name w:val="Abstract Title"/>

</xml_diff>

<commit_message>
add spread class section
</commit_message>
<xml_diff>
--- a/_book/examples/asciicast/asciicast-default.docx
+++ b/_book/examples/asciicast/asciicast-default.docx
@@ -2,7 +2,7 @@
 <file path=word/document.xml><?xml version="1.0" encoding="utf-8"?>
 <w:document xmlns:w="http://schemas.openxmlformats.org/wordprocessingml/2006/main" xmlns:m="http://schemas.openxmlformats.org/officeDocument/2006/math" xmlns:r="http://schemas.openxmlformats.org/officeDocument/2006/relationships" xmlns:o="urn:schemas-microsoft-com:office:office" xmlns:v="urn:schemas-microsoft-com:vml" xmlns:w10="urn:schemas-microsoft-com:office:word" xmlns:a="http://schemas.openxmlformats.org/drawingml/2006/main" xmlns:pic="http://schemas.openxmlformats.org/drawingml/2006/picture" xmlns:wp="http://schemas.openxmlformats.org/drawingml/2006/wordprocessingDrawing">
   <w:body>
-    <w:bookmarkStart w:id="23" w:name="default-asciicast-usage"/>
+    <w:bookmarkStart w:id="12" w:name="default-asciicast-usage"/>
     <w:p>
       <w:pPr>
         <w:pStyle w:val="Heading2"/>
@@ -49,12 +49,12 @@
           <wp:inline>
             <wp:extent cx="5334000" cy="2457450"/>
             <wp:effectExtent b="0" l="0" r="0" t="0"/>
-            <wp:docPr descr="" title="" id="21" name="Picture"/>
+            <wp:docPr descr="" title="" id="10" name="Picture"/>
             <a:graphic>
               <a:graphicData uri="http://schemas.openxmlformats.org/drawingml/2006/picture">
                 <pic:pic>
                   <pic:nvPicPr>
-                    <pic:cNvPr descr="asciicast-default_files/figure-docx//unnamed-chunk-2.svg" id="22" name="Picture"/>
+                    <pic:cNvPr descr="asciicast-default_files/figure-docx//unnamed-chunk-2.svg" id="11" name="Picture"/>
                     <pic:cNvPicPr>
                       <a:picLocks noChangeArrowheads="1" noChangeAspect="1"/>
                     </pic:cNvPicPr>
@@ -66,7 +66,7 @@
                           <a14:useLocalDpi xmlns:a14="http://schemas.microsoft.com/office/drawing/2010/main" val="0"/>
                         </a:ext>
                         <a:ext uri="{96DAC541-7B7A-43D3-8B79-37D633B846F1}">
-                          <asvg:svgBlip xmlns:asvg="http://schemas.microsoft.com/office/drawing/2016/SVG/main" r:embed="rId20"/>
+                          <asvg:svgBlip xmlns:asvg="http://schemas.microsoft.com/office/drawing/2016/SVG/main" r:embed="rId9"/>
                         </a:ext>
                       </a:extLst>
                     </a:blip>
@@ -96,8 +96,8 @@
         </w:drawing>
       </w:r>
     </w:p>
-    <w:bookmarkEnd w:id="23"/>
-    <w:bookmarkStart w:id="27" w:name="new-slide"/>
+    <w:bookmarkEnd w:id="12"/>
+    <w:bookmarkStart w:id="16" w:name="new-slide"/>
     <w:p>
       <w:pPr>
         <w:pStyle w:val="Heading2"/>
@@ -255,18 +255,18 @@
           <wp:inline>
             <wp:extent cx="5334000" cy="4267200"/>
             <wp:effectExtent b="0" l="0" r="0" t="0"/>
-            <wp:docPr descr="" title="" id="25" name="Picture"/>
+            <wp:docPr descr="" title="" id="14" name="Picture"/>
             <a:graphic>
               <a:graphicData uri="http://schemas.openxmlformats.org/drawingml/2006/picture">
                 <pic:pic>
                   <pic:nvPicPr>
-                    <pic:cNvPr descr="asciicast-default_files/figure-docx/unnamed-chunk-3-1.png" id="26" name="Picture"/>
+                    <pic:cNvPr descr="asciicast-default_files/figure-docx/unnamed-chunk-3-1.png" id="15" name="Picture"/>
                     <pic:cNvPicPr>
                       <a:picLocks noChangeArrowheads="1" noChangeAspect="1"/>
                     </pic:cNvPicPr>
                   </pic:nvPicPr>
                   <pic:blipFill>
-                    <a:blip r:embed="rId24"/>
+                    <a:blip r:embed="rId13"/>
                     <a:stretch>
                       <a:fillRect/>
                     </a:stretch>
@@ -293,7 +293,7 @@
         </w:drawing>
       </w:r>
     </w:p>
-    <w:bookmarkEnd w:id="27"/>
+    <w:bookmarkEnd w:id="16"/>
     <w:sectPr>
       <w:footnotePr>
         <w:numRestart w:val="eachSect"/>
@@ -415,10 +415,10 @@
   <w:docDefaults>
     <w:rPrDefault>
       <w:rPr>
-        <w:rFonts w:asciiTheme="minorHAnsi" w:cstheme="minorBidi" w:eastAsiaTheme="minorHAnsi" w:hAnsiTheme="minorHAnsi"/>
+        <w:rFonts w:asciiTheme="minorHAnsi" w:cstheme="minorBidi" w:eastAsiaTheme="minorEastAsia" w:hAnsiTheme="minorHAnsi"/>
         <w:sz w:val="24"/>
         <w:szCs w:val="24"/>
-        <w:lang w:bidi="ar-SA" w:eastAsia="en-US" w:val="en-US"/>
+        <w:lang w:bidi="ar-SA" w:eastAsia="zh-CN" w:val="en-US"/>
       </w:rPr>
     </w:rPrDefault>
     <w:pPrDefault>
@@ -959,13 +959,6 @@
       </w:tblCellMar>
     </w:tblPr>
     <w:tblStylePr w:type="firstRow">
-      <w:tblPr>
-        <w:jc w:val="left"/>
-        <w:tblInd w:type="dxa" w:w="0"/>
-      </w:tblPr>
-      <w:trPr>
-        <w:jc w:val="left"/>
-      </w:trPr>
       <w:tcPr>
         <w:tcBorders>
           <w:bottom w:val="single"/>

</xml_diff>